<commit_message>
Completo entrega 1 ecommerce backend avanzado
</commit_message>
<xml_diff>
--- a/ENTREGA1- Arzamendia-Backend Avanzado.docx
+++ b/ENTREGA1- Arzamendia-Backend Avanzado.docx
@@ -365,25 +365,7 @@
           <w:highlight w:val="green"/>
         </w:rPr>
         <w:lastRenderedPageBreak/>
-        <w:t xml:space="preserve">ENTREGAR </w:t>
-      </w:r>
-      <w:proofErr w:type="gramStart"/>
-      <w:r>
-        <w:rPr>
-          <w:b/>
-          <w:bCs/>
-          <w:highlight w:val="green"/>
-        </w:rPr>
-        <w:t>LINK</w:t>
-      </w:r>
-      <w:proofErr w:type="gramEnd"/>
-      <w:r>
-        <w:rPr>
-          <w:b/>
-          <w:bCs/>
-          <w:highlight w:val="green"/>
-        </w:rPr>
-        <w:t xml:space="preserve"> DEL REPO DE GITHUB</w:t>
+        <w:t>ENTREGAR LINK DEL REPO DE GITHUB</w:t>
       </w:r>
       <w:r>
         <w:rPr>
@@ -846,112 +828,61 @@
           <w:color w:val="A02B93" w:themeColor="accent5"/>
         </w:rPr>
       </w:pPr>
-      <w:proofErr w:type="gramStart"/>
-      <w:r>
-        <w:rPr>
-          <w:b/>
-          <w:bCs/>
-          <w:color w:val="A02B93" w:themeColor="accent5"/>
-        </w:rPr>
-        <w:t>LINK</w:t>
-      </w:r>
-      <w:proofErr w:type="gramEnd"/>
-      <w:r>
-        <w:rPr>
-          <w:b/>
-          <w:bCs/>
-          <w:color w:val="A02B93" w:themeColor="accent5"/>
-        </w:rPr>
-        <w:t xml:space="preserve"> GITHUB REPOSITORIO: </w:t>
-      </w:r>
-    </w:p>
-    <w:p>
-      <w:pPr>
-        <w:ind w:left="-567"/>
-        <w:jc w:val="center"/>
-        <w:rPr>
-          <w:b/>
-          <w:bCs/>
-          <w:color w:val="A02B93" w:themeColor="accent5"/>
-        </w:rPr>
-      </w:pPr>
-    </w:p>
-    <w:p>
-      <w:pPr>
-        <w:ind w:left="-567"/>
-        <w:jc w:val="center"/>
-        <w:rPr>
-          <w:b/>
-          <w:bCs/>
-          <w:color w:val="A02B93" w:themeColor="accent5"/>
-        </w:rPr>
-      </w:pPr>
-    </w:p>
-    <w:p>
-      <w:pPr>
-        <w:ind w:left="-567"/>
-        <w:jc w:val="center"/>
-        <w:rPr>
-          <w:b/>
-          <w:bCs/>
-          <w:color w:val="A02B93" w:themeColor="accent5"/>
-        </w:rPr>
-      </w:pPr>
-    </w:p>
-    <w:p>
-      <w:pPr>
-        <w:ind w:left="-567"/>
-        <w:jc w:val="center"/>
-        <w:rPr>
-          <w:b/>
-          <w:bCs/>
-          <w:color w:val="A02B93" w:themeColor="accent5"/>
-        </w:rPr>
-      </w:pPr>
-    </w:p>
-    <w:p>
-      <w:pPr>
-        <w:ind w:left="-567"/>
-        <w:jc w:val="center"/>
-        <w:rPr>
-          <w:b/>
-          <w:bCs/>
-          <w:color w:val="A02B93" w:themeColor="accent5"/>
-        </w:rPr>
-      </w:pPr>
-    </w:p>
-    <w:p>
-      <w:pPr>
-        <w:ind w:left="-567"/>
-        <w:jc w:val="center"/>
-        <w:rPr>
-          <w:b/>
-          <w:bCs/>
-          <w:color w:val="A02B93" w:themeColor="accent5"/>
-        </w:rPr>
-      </w:pPr>
-    </w:p>
-    <w:p>
-      <w:pPr>
-        <w:ind w:left="-567"/>
-        <w:jc w:val="center"/>
-        <w:rPr>
-          <w:b/>
-          <w:bCs/>
-          <w:color w:val="A02B93" w:themeColor="accent5"/>
-        </w:rPr>
-      </w:pPr>
-    </w:p>
-    <w:p>
-      <w:pPr>
-        <w:ind w:left="-567"/>
-        <w:jc w:val="center"/>
-        <w:rPr>
-          <w:b/>
-          <w:bCs/>
-          <w:color w:val="A02B93" w:themeColor="accent5"/>
-        </w:rPr>
-      </w:pPr>
+      <w:r>
+        <w:rPr>
+          <w:b/>
+          <w:bCs/>
+          <w:color w:val="A02B93" w:themeColor="accent5"/>
+        </w:rPr>
+        <w:t xml:space="preserve">LINK GITHUB REPOSITORIO: </w:t>
+      </w:r>
+    </w:p>
+    <w:p>
+      <w:pPr>
+        <w:ind w:left="-567"/>
+        <w:jc w:val="center"/>
+        <w:rPr>
+          <w:b/>
+          <w:bCs/>
+          <w:color w:val="A02B93" w:themeColor="accent5"/>
+        </w:rPr>
+      </w:pPr>
+      <w:hyperlink r:id="rId18" w:history="1">
+        <w:r>
+          <w:rPr>
+            <w:rStyle w:val="Hipervnculo"/>
+            <w:b/>
+            <w:bCs/>
+          </w:rPr>
+          <w:t>https://github.com/IvannaAr94/ENTREGA1--</w:t>
+        </w:r>
+        <w:proofErr w:type="spellStart"/>
+        <w:r>
+          <w:rPr>
+            <w:rStyle w:val="Hipervnculo"/>
+            <w:b/>
+            <w:bCs/>
+          </w:rPr>
+          <w:t>Ecommerse</w:t>
+        </w:r>
+        <w:proofErr w:type="spellEnd"/>
+        <w:r>
+          <w:rPr>
+            <w:rStyle w:val="Hipervnculo"/>
+            <w:b/>
+            <w:bCs/>
+          </w:rPr>
+          <w:t>-Arzamendia-Backend-Avanzado</w:t>
+        </w:r>
+      </w:hyperlink>
+      <w:r>
+        <w:rPr>
+          <w:b/>
+          <w:bCs/>
+          <w:color w:val="A02B93" w:themeColor="accent5"/>
+        </w:rPr>
+        <w:t xml:space="preserve"> </w:t>
+      </w:r>
     </w:p>
     <w:p>
       <w:pPr>
@@ -967,7 +898,167 @@
         <w:rPr>
           <w:noProof/>
         </w:rPr>
-        <w:lastRenderedPageBreak/>
+        <w:drawing>
+          <wp:inline distT="0" distB="0" distL="0" distR="0" wp14:anchorId="551A06B4" wp14:editId="7E8D7E84">
+            <wp:extent cx="6609048" cy="2083981"/>
+            <wp:effectExtent l="0" t="0" r="1905" b="0"/>
+            <wp:docPr id="1932868333" name="Imagen 1"/>
+            <wp:cNvGraphicFramePr>
+              <a:graphicFrameLocks xmlns:a="http://schemas.openxmlformats.org/drawingml/2006/main" noChangeAspect="1"/>
+            </wp:cNvGraphicFramePr>
+            <a:graphic xmlns:a="http://schemas.openxmlformats.org/drawingml/2006/main">
+              <a:graphicData uri="http://schemas.openxmlformats.org/drawingml/2006/picture">
+                <pic:pic xmlns:pic="http://schemas.openxmlformats.org/drawingml/2006/picture">
+                  <pic:nvPicPr>
+                    <pic:cNvPr id="1932868333" name=""/>
+                    <pic:cNvPicPr/>
+                  </pic:nvPicPr>
+                  <pic:blipFill>
+                    <a:blip r:embed="rId19"/>
+                    <a:stretch>
+                      <a:fillRect/>
+                    </a:stretch>
+                  </pic:blipFill>
+                  <pic:spPr>
+                    <a:xfrm>
+                      <a:off x="0" y="0"/>
+                      <a:ext cx="6629467" cy="2090420"/>
+                    </a:xfrm>
+                    <a:prstGeom prst="rect">
+                      <a:avLst/>
+                    </a:prstGeom>
+                  </pic:spPr>
+                </pic:pic>
+              </a:graphicData>
+            </a:graphic>
+          </wp:inline>
+        </w:drawing>
+      </w:r>
+    </w:p>
+    <w:p>
+      <w:pPr>
+        <w:ind w:left="-567"/>
+        <w:jc w:val="center"/>
+        <w:rPr>
+          <w:b/>
+          <w:bCs/>
+          <w:color w:val="A02B93" w:themeColor="accent5"/>
+        </w:rPr>
+      </w:pPr>
+      <w:r>
+        <w:rPr>
+          <w:b/>
+          <w:bCs/>
+          <w:color w:val="A02B93" w:themeColor="accent5"/>
+        </w:rPr>
+        <w:t xml:space="preserve">hola profe! no lo pude hacer, dejo el Repo creado en GitHub. esta </w:t>
+      </w:r>
+      <w:proofErr w:type="spellStart"/>
+      <w:r>
+        <w:rPr>
+          <w:b/>
+          <w:bCs/>
+          <w:color w:val="A02B93" w:themeColor="accent5"/>
+        </w:rPr>
+        <w:t>vacio</w:t>
+      </w:r>
+      <w:proofErr w:type="spellEnd"/>
+      <w:r>
+        <w:rPr>
+          <w:b/>
+          <w:bCs/>
+          <w:color w:val="A02B93" w:themeColor="accent5"/>
+        </w:rPr>
+        <w:t xml:space="preserve">. De coder dijeron que no iban a cambiar la fecha x </w:t>
+      </w:r>
+      <w:proofErr w:type="spellStart"/>
+      <w:r>
+        <w:rPr>
+          <w:b/>
+          <w:bCs/>
+          <w:color w:val="A02B93" w:themeColor="accent5"/>
+        </w:rPr>
+        <w:t>mas</w:t>
+      </w:r>
+      <w:proofErr w:type="spellEnd"/>
+      <w:r>
+        <w:rPr>
+          <w:b/>
+          <w:bCs/>
+          <w:color w:val="A02B93" w:themeColor="accent5"/>
+        </w:rPr>
+        <w:t xml:space="preserve"> que ellos hayan cometido el error.. asique hice lo que dijo usted de x lo menos crear el repo.</w:t>
+      </w:r>
+    </w:p>
+    <w:p>
+      <w:pPr>
+        <w:ind w:left="-567"/>
+        <w:jc w:val="center"/>
+        <w:rPr>
+          <w:b/>
+          <w:bCs/>
+          <w:color w:val="A02B93" w:themeColor="accent5"/>
+        </w:rPr>
+      </w:pPr>
+    </w:p>
+    <w:p>
+      <w:pPr>
+        <w:ind w:left="-567"/>
+        <w:jc w:val="center"/>
+        <w:rPr>
+          <w:b/>
+          <w:bCs/>
+          <w:color w:val="A02B93" w:themeColor="accent5"/>
+        </w:rPr>
+      </w:pPr>
+    </w:p>
+    <w:p>
+      <w:pPr>
+        <w:ind w:left="-567"/>
+        <w:jc w:val="center"/>
+        <w:rPr>
+          <w:b/>
+          <w:bCs/>
+          <w:color w:val="A02B93" w:themeColor="accent5"/>
+        </w:rPr>
+      </w:pPr>
+    </w:p>
+    <w:p>
+      <w:pPr>
+        <w:ind w:left="-567"/>
+        <w:jc w:val="center"/>
+        <w:rPr>
+          <w:b/>
+          <w:bCs/>
+          <w:color w:val="A02B93" w:themeColor="accent5"/>
+        </w:rPr>
+      </w:pPr>
+    </w:p>
+    <w:p>
+      <w:pPr>
+        <w:ind w:left="-567"/>
+        <w:jc w:val="center"/>
+        <w:rPr>
+          <w:b/>
+          <w:bCs/>
+          <w:color w:val="A02B93" w:themeColor="accent5"/>
+        </w:rPr>
+      </w:pPr>
+    </w:p>
+    <w:p>
+      <w:pPr>
+        <w:ind w:left="-567"/>
+        <w:jc w:val="center"/>
+        <w:rPr>
+          <w:b/>
+          <w:bCs/>
+          <w:color w:val="A02B93" w:themeColor="accent5"/>
+        </w:rPr>
+      </w:pPr>
+      <w:r>
+        <w:rPr>
+          <w:noProof/>
+        </w:rPr>
         <w:drawing>
           <wp:inline distT="0" distB="0" distL="0" distR="0" wp14:anchorId="18C1D11E" wp14:editId="3C362651">
             <wp:extent cx="7240270" cy="5645888"/>
@@ -984,7 +1075,7 @@
                     <pic:cNvPicPr/>
                   </pic:nvPicPr>
                   <pic:blipFill>
-                    <a:blip r:embed="rId18"/>
+                    <a:blip r:embed="rId20"/>
                     <a:stretch>
                       <a:fillRect/>
                     </a:stretch>

</xml_diff>